<commit_message>
add new articles on accuracy
</commit_message>
<xml_diff>
--- a/Sasidhar_Chintapalli_Resume.docx
+++ b/Sasidhar_Chintapalli_Resume.docx
@@ -170,7 +170,7 @@
         <w:rPr>
           <w:color w:val="555555"/>
         </w:rPr>
-        <w:t xml:space="preserve"> ETL/ELT Pipelines</w:t>
+        <w:t xml:space="preserve"> PostgreSQL, Kuzu (Graph DB), ETL/ELT Pipelines</w:t>
       </w:r>
     </w:p>
     <w:p>
@@ -218,7 +218,7 @@
         <w:rPr>
           <w:color w:val="555555"/>
         </w:rPr>
-        <w:t>, Generative AI, LLM Integration, ML Pipelines</w:t>
+        <w:t>, Generative AI, LLM Integration, NL-to-SQL, Hybrid Retrieval (BM25 / pgvector / RRF), LLM Evaluation, ML Pipelines</w:t>
       </w:r>
     </w:p>
     <w:p>
@@ -258,7 +258,7 @@
         <w:rPr>
           <w:color w:val="555555"/>
         </w:rPr>
-        <w:t>Python, Java, SQL</w:t>
+        <w:t>Python, Java, TypeScript, SQL, Cypher</w:t>
       </w:r>
     </w:p>
     <w:p>
@@ -564,6 +564,84 @@
         <w:rPr>
           <w:color w:val="333333"/>
         </w:rPr>
+        <w:t xml:space="preserve">• Led an </w:t>
+      </w:r>
+      <w:r>
+        <w:rPr>
+          <w:b/>
+          <w:bCs/>
+          <w:color w:val="333333"/>
+        </w:rPr>
+        <w:t xml:space="preserve">NL-to-SQL accuracy enhancement</w:t>
+      </w:r>
+      <w:r>
+        <w:rPr>
+          <w:color w:val="333333"/>
+        </w:rPr>
+        <w:t xml:space="preserve"> program for the Data Analyst Agent: built a hybrid retrieval pipeline fusing BM25 full-text (Postgres), pgvector semantic search and LSH value matching via Reciprocal Rank Fusion + cross-encoder reranking, with Kuzu graph shortest-path traversal over FK relations to resolve join paths.</w:t>
+      </w:r>
+    </w:p>
+    <w:p>
+      <w:pPr>
+        <w:spacing w:before="20" w:after="20"/>
+        <w:ind w:left="360" w:hanging="200"/>
+      </w:pPr>
+      <w:r>
+        <w:rPr>
+          <w:color w:val="333333"/>
+        </w:rPr>
+        <w:t xml:space="preserve">• Achieved </w:t>
+      </w:r>
+      <w:r>
+        <w:rPr>
+          <w:b/>
+          <w:bCs/>
+          <w:color w:val="333333"/>
+        </w:rPr>
+        <w:t xml:space="preserve">~72% execution accuracy on the BIRD mini-dev benchmark</w:t>
+      </w:r>
+      <w:r>
+        <w:rPr>
+          <w:color w:val="333333"/>
+        </w:rPr>
+        <w:t xml:space="preserve"> (500 questions; 70.9% on the full 1,534-question BIRD dev set) using open-weight models (Gemma 4 31B, Qwen3), via graph-based join-path recovery, compact context assembly, conflict-free layered prompts and a deterministic draft-verify gate, after measuring that multi-agent ensembles and LLM judges did not pay for their cost.</w:t>
+      </w:r>
+    </w:p>
+    <w:p>
+      <w:pPr>
+        <w:spacing w:before="20" w:after="20"/>
+        <w:ind w:left="360" w:hanging="200"/>
+      </w:pPr>
+      <w:r>
+        <w:rPr>
+          <w:color w:val="333333"/>
+        </w:rPr>
+        <w:t xml:space="preserve">• Built a </w:t>
+      </w:r>
+      <w:r>
+        <w:rPr>
+          <w:b/>
+          <w:bCs/>
+          <w:color w:val="333333"/>
+        </w:rPr>
+        <w:t xml:space="preserve">reproducible evaluation harness</w:t>
+      </w:r>
+      <w:r>
+        <w:rPr>
+          <w:color w:val="333333"/>
+        </w:rPr>
+        <w:t xml:space="preserve"> (official BIRD EX scoring, per-difficulty breakdowns, run manifests with git/config capture, regression/sentinel subsets) and a measured ~1.5-pt noise floor, so every change is accepted on consistent question flips rather than single-run deltas.</w:t>
+      </w:r>
+    </w:p>
+    <w:p>
+      <w:pPr>
+        <w:spacing w:before="20" w:after="20"/>
+        <w:ind w:left="360" w:hanging="200"/>
+      </w:pPr>
+      <w:r>
+        <w:rPr>
+          <w:color w:val="333333"/>
+        </w:rPr>
         <w:t xml:space="preserve">• Leading </w:t>
       </w:r>
       <w:r>
@@ -1542,6 +1620,121 @@
           <w:color w:val="333333"/>
         </w:rPr>
         <w:t>• Worked on Global Travel backend feed processing platform and release engineering.</w:t>
+      </w:r>
+    </w:p>
+    <w:p>
+      <w:pPr>
+        <w:pBdr>
+          <w:bottom w:val="single" w:sz="3" w:space="4" w:color="2D6A8F"/>
+        </w:pBdr>
+        <w:spacing w:before="200" w:after="60"/>
+      </w:pPr>
+      <w:r>
+        <w:rPr>
+          <w:b/>
+          <w:bCs/>
+          <w:color w:val="2D6A8F"/>
+          <w:sz w:val="22"/>
+          <w:szCs w:val="22"/>
+        </w:rPr>
+        <w:t>OPEN SOURCE</w:t>
+      </w:r>
+    </w:p>
+    <w:p>
+      <w:pPr>
+        <w:spacing w:before="60" w:after="20"/>
+      </w:pPr>
+      <w:r>
+        <w:rPr>
+          <w:b/>
+          <w:bCs/>
+          <w:color w:val="333333"/>
+        </w:rPr>
+        <w:t xml:space="preserve">Kuzu Explorer</w:t>
+      </w:r>
+      <w:r>
+        <w:rPr>
+          <w:color w:val="555555"/>
+        </w:rPr>
+        <w:t xml:space="preserve">  |  VS Code extension for the Kuzu graph database  |  TypeScript, Node.js  |  github.com/gaintlabs/kuzu-viewer</w:t>
+      </w:r>
+    </w:p>
+    <w:p>
+      <w:pPr>
+        <w:spacing w:before="20" w:after="20"/>
+        <w:ind w:left="360" w:hanging="200"/>
+      </w:pPr>
+      <w:r>
+        <w:rPr>
+          <w:color w:val="333333"/>
+        </w:rPr>
+        <w:t xml:space="preserve">• Built and open-sourced (MIT) a </w:t>
+      </w:r>
+      <w:r>
+        <w:rPr>
+          <w:b/>
+          <w:bCs/>
+          <w:color w:val="333333"/>
+        </w:rPr>
+        <w:t xml:space="preserve">VS Code extension</w:t>
+      </w:r>
+      <w:r>
+        <w:rPr>
+          <w:color w:val="333333"/>
+        </w:rPr>
+        <w:t xml:space="preserve"> to browse Kuzu graph databases in the editor: schema tree of node/rel tables, sortable table-data grid, Cypher query panel and an interactive Cytoscape graph view; ported from an original FastAPI web app.</w:t>
+      </w:r>
+    </w:p>
+    <w:p>
+      <w:pPr>
+        <w:spacing w:before="20" w:after="20"/>
+        <w:ind w:left="360" w:hanging="200"/>
+      </w:pPr>
+      <w:r>
+        <w:rPr>
+          <w:color w:val="333333"/>
+        </w:rPr>
+        <w:t xml:space="preserve">• Isolated the native Kuzu addon in a </w:t>
+      </w:r>
+      <w:r>
+        <w:rPr>
+          <w:b/>
+          <w:bCs/>
+          <w:color w:val="333333"/>
+        </w:rPr>
+        <w:t xml:space="preserve">system-Node worker process over newline-delimited JSON-RPC</w:t>
+      </w:r>
+      <w:r>
+        <w:rPr>
+          <w:color w:val="333333"/>
+        </w:rPr>
+        <w:t xml:space="preserve"> to avoid Electron ABI mismatches; read-only by default with a write-query guard and transparent snapshot fallback when the database is locked.</w:t>
+      </w:r>
+    </w:p>
+    <w:p>
+      <w:pPr>
+        <w:spacing w:before="20" w:after="20"/>
+        <w:ind w:left="360" w:hanging="200"/>
+      </w:pPr>
+      <w:r>
+        <w:rPr>
+          <w:color w:val="333333"/>
+        </w:rPr>
+        <w:t xml:space="preserve">• Set up a </w:t>
+      </w:r>
+      <w:r>
+        <w:rPr>
+          <w:b/>
+          <w:bCs/>
+          <w:color w:val="333333"/>
+        </w:rPr>
+        <w:t xml:space="preserve">GitHub Actions release pipeline</w:t>
+      </w:r>
+      <w:r>
+        <w:rPr>
+          <w:color w:val="333333"/>
+        </w:rPr>
+        <w:t xml:space="preserve"> building platform-specific VSIX packages (Linux x64, Windows x64, macOS x64/arm64) with an automated VS Code Marketplace publish step.</w:t>
       </w:r>
     </w:p>
     <w:p>

</xml_diff>

<commit_message>
update website to download pdf and add nl-to-sql findinds blog
</commit_message>
<xml_diff>
--- a/Sasidhar_Chintapalli_Resume.docx
+++ b/Sasidhar_Chintapalli_Resume.docx
@@ -106,7 +106,7 @@
         <w:rPr>
           <w:color w:val="333333"/>
         </w:rPr>
-        <w:t>Engineering leader with 17+ years of experience architecting large-scale distributed data platforms, cloud-native systems, and AI-powered enterprise applications. Proven track record of designing production-grade data layers, custom Spark compute frameworks on Kubernetes, and agentic AI systems that automate the data engineering lifecycle. Adept at leading cross-functional teams from zero-to-one product builds through to enterprise-scale deployment, with deep expertise spanning data engineering, containerized infrastructure, and Generative AI integration.</w:t>
+        <w:t>Engineering leader with 18+ years of experience architecting large-scale distributed data platforms, cloud-native systems, and AI-powered enterprise applications. Proven track record of designing production-grade data layers, custom Spark compute frameworks on Kubernetes, and agentic AI systems that automate the data engineering lifecycle. Adept at leading cross-functional teams from zero-to-one product builds through to enterprise-scale deployment, with deep expertise spanning data engineering, containerized infrastructure, and Generative AI integration.</w:t>
       </w:r>
     </w:p>
     <w:p>
@@ -378,7 +378,7 @@
         <w:rPr>
           <w:color w:val="333333"/>
         </w:rPr>
-        <w:t xml:space="preserve"> by architecting a 5-layer </w:t>
+        <w:t xml:space="preserve"> by architecting a 4-layer </w:t>
       </w:r>
       <w:r>
         <w:rPr>

</xml_diff>